<commit_message>
Rate research use low and drop the independence test on an outside firm
From the Procurement Working Group walkthrough of 2026-10-28. Research use by one
group, lab or project rates low for scope and for criticality, so a tool used by a
small research group is not read as a core academic function. An outside firm is
any firm other than the vendor; whether the vendor owns, is affiliated with or pays
the firm cannot be verified from the report, so the author qualification no longer
asks. The model, the form, the definitions, the core and the Word document carry
both changes, and the published copy under public_reports is refreshed.

Co-Authored-By: Claude Fable 5.1 <noreply@anthropic.com>
</commit_message>
<xml_diff>
--- a/app/database/ontology/impact-matrix/SFBRN-Accessible-Procurement-Rubric.docx
+++ b/app/database/ontology/impact-matrix/SFBRN-Accessible-Procurement-Rubric.docx
@@ -29,7 +29,7 @@
         <w:rPr>
           <w:i/>
         </w:rPr>
-        <w:t>Review matrix version 3. Built 2026-10-23 from review-matrix.js, the model the SFBRN campuses run.</w:t>
+        <w:t>Review matrix version 3. Built 2026-10-28 from review-matrix.js, the model the SFBRN campuses run.</w:t>
       </w:r>
     </w:p>
     <w:p/>
@@ -89,7 +89,7 @@
       <w:r>
         <w:fldChar w:fldCharType="separate"/>
       </w:r>
-      <w:hyperlink w:anchor="_Toc243647874" w:history="1">
+      <w:hyperlink w:anchor="_Toc244085219" w:history="1">
         <w:r>
           <w:rPr>
             <w:rStyle w:val="Hyperlink"/>
@@ -134,7 +134,7 @@
             <w:noProof/>
             <w:webHidden/>
           </w:rPr>
-          <w:instrText xml:space="preserve"> PAGEREF _Toc243647874 \h </w:instrText>
+          <w:instrText xml:space="preserve"> PAGEREF _Toc244085219 \h </w:instrText>
         </w:r>
         <w:r>
           <w:rPr>
@@ -181,7 +181,7 @@
           <w14:ligatures w14:val="standardContextual"/>
         </w:rPr>
       </w:pPr>
-      <w:hyperlink w:anchor="_Toc243647875" w:history="1">
+      <w:hyperlink w:anchor="_Toc244085220" w:history="1">
         <w:r>
           <w:rPr>
             <w:rStyle w:val="Hyperlink"/>
@@ -226,7 +226,7 @@
             <w:noProof/>
             <w:webHidden/>
           </w:rPr>
-          <w:instrText xml:space="preserve"> PAGEREF _Toc243647875 \h </w:instrText>
+          <w:instrText xml:space="preserve"> PAGEREF _Toc244085220 \h </w:instrText>
         </w:r>
         <w:r>
           <w:rPr>
@@ -273,7 +273,7 @@
           <w14:ligatures w14:val="standardContextual"/>
         </w:rPr>
       </w:pPr>
-      <w:hyperlink w:anchor="_Toc243647876" w:history="1">
+      <w:hyperlink w:anchor="_Toc244085221" w:history="1">
         <w:r>
           <w:rPr>
             <w:rStyle w:val="Hyperlink"/>
@@ -318,7 +318,7 @@
             <w:noProof/>
             <w:webHidden/>
           </w:rPr>
-          <w:instrText xml:space="preserve"> PAGEREF _Toc243647876 \h </w:instrText>
+          <w:instrText xml:space="preserve"> PAGEREF _Toc244085221 \h </w:instrText>
         </w:r>
         <w:r>
           <w:rPr>
@@ -365,7 +365,7 @@
           <w14:ligatures w14:val="standardContextual"/>
         </w:rPr>
       </w:pPr>
-      <w:hyperlink w:anchor="_Toc243647877" w:history="1">
+      <w:hyperlink w:anchor="_Toc244085222" w:history="1">
         <w:r>
           <w:rPr>
             <w:rStyle w:val="Hyperlink"/>
@@ -410,7 +410,7 @@
             <w:noProof/>
             <w:webHidden/>
           </w:rPr>
-          <w:instrText xml:space="preserve"> PAGEREF _Toc243647877 \h </w:instrText>
+          <w:instrText xml:space="preserve"> PAGEREF _Toc244085222 \h </w:instrText>
         </w:r>
         <w:r>
           <w:rPr>
@@ -457,7 +457,7 @@
           <w14:ligatures w14:val="standardContextual"/>
         </w:rPr>
       </w:pPr>
-      <w:hyperlink w:anchor="_Toc243647878" w:history="1">
+      <w:hyperlink w:anchor="_Toc244085223" w:history="1">
         <w:r>
           <w:rPr>
             <w:rStyle w:val="Hyperlink"/>
@@ -502,7 +502,7 @@
             <w:noProof/>
             <w:webHidden/>
           </w:rPr>
-          <w:instrText xml:space="preserve"> PAGEREF _Toc243647878 \h </w:instrText>
+          <w:instrText xml:space="preserve"> PAGEREF _Toc244085223 \h </w:instrText>
         </w:r>
         <w:r>
           <w:rPr>
@@ -549,7 +549,7 @@
           <w14:ligatures w14:val="standardContextual"/>
         </w:rPr>
       </w:pPr>
-      <w:hyperlink w:anchor="_Toc243647879" w:history="1">
+      <w:hyperlink w:anchor="_Toc244085224" w:history="1">
         <w:r>
           <w:rPr>
             <w:rStyle w:val="Hyperlink"/>
@@ -594,7 +594,7 @@
             <w:noProof/>
             <w:webHidden/>
           </w:rPr>
-          <w:instrText xml:space="preserve"> PAGEREF _Toc243647879 \h </w:instrText>
+          <w:instrText xml:space="preserve"> PAGEREF _Toc244085224 \h </w:instrText>
         </w:r>
         <w:r>
           <w:rPr>
@@ -641,7 +641,7 @@
           <w14:ligatures w14:val="standardContextual"/>
         </w:rPr>
       </w:pPr>
-      <w:hyperlink w:anchor="_Toc243647880" w:history="1">
+      <w:hyperlink w:anchor="_Toc244085225" w:history="1">
         <w:r>
           <w:rPr>
             <w:rStyle w:val="Hyperlink"/>
@@ -686,7 +686,7 @@
             <w:noProof/>
             <w:webHidden/>
           </w:rPr>
-          <w:instrText xml:space="preserve"> PAGEREF _Toc243647880 \h </w:instrText>
+          <w:instrText xml:space="preserve"> PAGEREF _Toc244085225 \h </w:instrText>
         </w:r>
         <w:r>
           <w:rPr>
@@ -733,7 +733,7 @@
           <w14:ligatures w14:val="standardContextual"/>
         </w:rPr>
       </w:pPr>
-      <w:hyperlink w:anchor="_Toc243647881" w:history="1">
+      <w:hyperlink w:anchor="_Toc244085226" w:history="1">
         <w:r>
           <w:rPr>
             <w:rStyle w:val="Hyperlink"/>
@@ -778,7 +778,7 @@
             <w:noProof/>
             <w:webHidden/>
           </w:rPr>
-          <w:instrText xml:space="preserve"> PAGEREF _Toc243647881 \h </w:instrText>
+          <w:instrText xml:space="preserve"> PAGEREF _Toc244085226 \h </w:instrText>
         </w:r>
         <w:r>
           <w:rPr>
@@ -825,7 +825,7 @@
           <w14:ligatures w14:val="standardContextual"/>
         </w:rPr>
       </w:pPr>
-      <w:hyperlink w:anchor="_Toc243647882" w:history="1">
+      <w:hyperlink w:anchor="_Toc244085227" w:history="1">
         <w:r>
           <w:rPr>
             <w:rStyle w:val="Hyperlink"/>
@@ -870,7 +870,7 @@
             <w:noProof/>
             <w:webHidden/>
           </w:rPr>
-          <w:instrText xml:space="preserve"> PAGEREF _Toc243647882 \h </w:instrText>
+          <w:instrText xml:space="preserve"> PAGEREF _Toc244085227 \h </w:instrText>
         </w:r>
         <w:r>
           <w:rPr>
@@ -917,7 +917,7 @@
           <w14:ligatures w14:val="standardContextual"/>
         </w:rPr>
       </w:pPr>
-      <w:hyperlink w:anchor="_Toc243647883" w:history="1">
+      <w:hyperlink w:anchor="_Toc244085228" w:history="1">
         <w:r>
           <w:rPr>
             <w:rStyle w:val="Hyperlink"/>
@@ -962,7 +962,7 @@
             <w:noProof/>
             <w:webHidden/>
           </w:rPr>
-          <w:instrText xml:space="preserve"> PAGEREF _Toc243647883 \h </w:instrText>
+          <w:instrText xml:space="preserve"> PAGEREF _Toc244085228 \h </w:instrText>
         </w:r>
         <w:r>
           <w:rPr>
@@ -1009,7 +1009,7 @@
           <w14:ligatures w14:val="standardContextual"/>
         </w:rPr>
       </w:pPr>
-      <w:hyperlink w:anchor="_Toc243647884" w:history="1">
+      <w:hyperlink w:anchor="_Toc244085229" w:history="1">
         <w:r>
           <w:rPr>
             <w:rStyle w:val="Hyperlink"/>
@@ -1054,7 +1054,7 @@
             <w:noProof/>
             <w:webHidden/>
           </w:rPr>
-          <w:instrText xml:space="preserve"> PAGEREF _Toc243647884 \h </w:instrText>
+          <w:instrText xml:space="preserve"> PAGEREF _Toc244085229 \h </w:instrText>
         </w:r>
         <w:r>
           <w:rPr>
@@ -1101,7 +1101,7 @@
           <w14:ligatures w14:val="standardContextual"/>
         </w:rPr>
       </w:pPr>
-      <w:hyperlink w:anchor="_Toc243647885" w:history="1">
+      <w:hyperlink w:anchor="_Toc244085230" w:history="1">
         <w:r>
           <w:rPr>
             <w:rStyle w:val="Hyperlink"/>
@@ -1146,7 +1146,7 @@
             <w:noProof/>
             <w:webHidden/>
           </w:rPr>
-          <w:instrText xml:space="preserve"> PAGEREF _Toc243647885 \h </w:instrText>
+          <w:instrText xml:space="preserve"> PAGEREF _Toc244085230 \h </w:instrText>
         </w:r>
         <w:r>
           <w:rPr>
@@ -1193,7 +1193,7 @@
           <w14:ligatures w14:val="standardContextual"/>
         </w:rPr>
       </w:pPr>
-      <w:hyperlink w:anchor="_Toc243647886" w:history="1">
+      <w:hyperlink w:anchor="_Toc244085231" w:history="1">
         <w:r>
           <w:rPr>
             <w:rStyle w:val="Hyperlink"/>
@@ -1238,7 +1238,7 @@
             <w:noProof/>
             <w:webHidden/>
           </w:rPr>
-          <w:instrText xml:space="preserve"> PAGEREF _Toc243647886 \h </w:instrText>
+          <w:instrText xml:space="preserve"> PAGEREF _Toc244085231 \h </w:instrText>
         </w:r>
         <w:r>
           <w:rPr>
@@ -1285,7 +1285,7 @@
           <w14:ligatures w14:val="standardContextual"/>
         </w:rPr>
       </w:pPr>
-      <w:hyperlink w:anchor="_Toc243647887" w:history="1">
+      <w:hyperlink w:anchor="_Toc244085232" w:history="1">
         <w:r>
           <w:rPr>
             <w:rStyle w:val="Hyperlink"/>
@@ -1330,7 +1330,7 @@
             <w:noProof/>
             <w:webHidden/>
           </w:rPr>
-          <w:instrText xml:space="preserve"> PAGEREF _Toc243647887 \h </w:instrText>
+          <w:instrText xml:space="preserve"> PAGEREF _Toc244085232 \h </w:instrText>
         </w:r>
         <w:r>
           <w:rPr>
@@ -1377,7 +1377,7 @@
           <w14:ligatures w14:val="standardContextual"/>
         </w:rPr>
       </w:pPr>
-      <w:hyperlink w:anchor="_Toc243647888" w:history="1">
+      <w:hyperlink w:anchor="_Toc244085233" w:history="1">
         <w:r>
           <w:rPr>
             <w:rStyle w:val="Hyperlink"/>
@@ -1422,7 +1422,7 @@
             <w:noProof/>
             <w:webHidden/>
           </w:rPr>
-          <w:instrText xml:space="preserve"> PAGEREF _Toc243647888 \h </w:instrText>
+          <w:instrText xml:space="preserve"> PAGEREF _Toc244085233 \h </w:instrText>
         </w:r>
         <w:r>
           <w:rPr>
@@ -1469,7 +1469,7 @@
           <w14:ligatures w14:val="standardContextual"/>
         </w:rPr>
       </w:pPr>
-      <w:hyperlink w:anchor="_Toc243647889" w:history="1">
+      <w:hyperlink w:anchor="_Toc244085234" w:history="1">
         <w:r>
           <w:rPr>
             <w:rStyle w:val="Hyperlink"/>
@@ -1514,7 +1514,7 @@
             <w:noProof/>
             <w:webHidden/>
           </w:rPr>
-          <w:instrText xml:space="preserve"> PAGEREF _Toc243647889 \h </w:instrText>
+          <w:instrText xml:space="preserve"> PAGEREF _Toc244085234 \h </w:instrText>
         </w:r>
         <w:r>
           <w:rPr>
@@ -1561,7 +1561,7 @@
           <w14:ligatures w14:val="standardContextual"/>
         </w:rPr>
       </w:pPr>
-      <w:hyperlink w:anchor="_Toc243647890" w:history="1">
+      <w:hyperlink w:anchor="_Toc244085235" w:history="1">
         <w:r>
           <w:rPr>
             <w:rStyle w:val="Hyperlink"/>
@@ -1606,7 +1606,7 @@
             <w:noProof/>
             <w:webHidden/>
           </w:rPr>
-          <w:instrText xml:space="preserve"> PAGEREF _Toc243647890 \h </w:instrText>
+          <w:instrText xml:space="preserve"> PAGEREF _Toc244085235 \h </w:instrText>
         </w:r>
         <w:r>
           <w:rPr>
@@ -1653,7 +1653,7 @@
           <w14:ligatures w14:val="standardContextual"/>
         </w:rPr>
       </w:pPr>
-      <w:hyperlink w:anchor="_Toc243647891" w:history="1">
+      <w:hyperlink w:anchor="_Toc244085236" w:history="1">
         <w:r>
           <w:rPr>
             <w:rStyle w:val="Hyperlink"/>
@@ -1698,7 +1698,7 @@
             <w:noProof/>
             <w:webHidden/>
           </w:rPr>
-          <w:instrText xml:space="preserve"> PAGEREF _Toc243647891 \h </w:instrText>
+          <w:instrText xml:space="preserve"> PAGEREF _Toc244085236 \h </w:instrText>
         </w:r>
         <w:r>
           <w:rPr>
@@ -1745,7 +1745,7 @@
           <w14:ligatures w14:val="standardContextual"/>
         </w:rPr>
       </w:pPr>
-      <w:hyperlink w:anchor="_Toc243647892" w:history="1">
+      <w:hyperlink w:anchor="_Toc244085237" w:history="1">
         <w:r>
           <w:rPr>
             <w:rStyle w:val="Hyperlink"/>
@@ -1790,7 +1790,7 @@
             <w:noProof/>
             <w:webHidden/>
           </w:rPr>
-          <w:instrText xml:space="preserve"> PAGEREF _Toc243647892 \h </w:instrText>
+          <w:instrText xml:space="preserve"> PAGEREF _Toc244085237 \h </w:instrText>
         </w:r>
         <w:r>
           <w:rPr>
@@ -1837,7 +1837,7 @@
           <w14:ligatures w14:val="standardContextual"/>
         </w:rPr>
       </w:pPr>
-      <w:hyperlink w:anchor="_Toc243647893" w:history="1">
+      <w:hyperlink w:anchor="_Toc244085238" w:history="1">
         <w:r>
           <w:rPr>
             <w:rStyle w:val="Hyperlink"/>
@@ -1882,7 +1882,7 @@
             <w:noProof/>
             <w:webHidden/>
           </w:rPr>
-          <w:instrText xml:space="preserve"> PAGEREF _Toc243647893 \h </w:instrText>
+          <w:instrText xml:space="preserve"> PAGEREF _Toc244085238 \h </w:instrText>
         </w:r>
         <w:r>
           <w:rPr>
@@ -1929,7 +1929,7 @@
           <w14:ligatures w14:val="standardContextual"/>
         </w:rPr>
       </w:pPr>
-      <w:hyperlink w:anchor="_Toc243647894" w:history="1">
+      <w:hyperlink w:anchor="_Toc244085239" w:history="1">
         <w:r>
           <w:rPr>
             <w:rStyle w:val="Hyperlink"/>
@@ -1974,7 +1974,7 @@
             <w:noProof/>
             <w:webHidden/>
           </w:rPr>
-          <w:instrText xml:space="preserve"> PAGEREF _Toc243647894 \h </w:instrText>
+          <w:instrText xml:space="preserve"> PAGEREF _Toc244085239 \h </w:instrText>
         </w:r>
         <w:r>
           <w:rPr>
@@ -2021,7 +2021,7 @@
           <w14:ligatures w14:val="standardContextual"/>
         </w:rPr>
       </w:pPr>
-      <w:hyperlink w:anchor="_Toc243647895" w:history="1">
+      <w:hyperlink w:anchor="_Toc244085240" w:history="1">
         <w:r>
           <w:rPr>
             <w:rStyle w:val="Hyperlink"/>
@@ -2066,7 +2066,7 @@
             <w:noProof/>
             <w:webHidden/>
           </w:rPr>
-          <w:instrText xml:space="preserve"> PAGEREF _Toc243647895 \h </w:instrText>
+          <w:instrText xml:space="preserve"> PAGEREF _Toc244085240 \h </w:instrText>
         </w:r>
         <w:r>
           <w:rPr>
@@ -2113,7 +2113,7 @@
           <w14:ligatures w14:val="standardContextual"/>
         </w:rPr>
       </w:pPr>
-      <w:hyperlink w:anchor="_Toc243647896" w:history="1">
+      <w:hyperlink w:anchor="_Toc244085241" w:history="1">
         <w:r>
           <w:rPr>
             <w:rStyle w:val="Hyperlink"/>
@@ -2158,7 +2158,7 @@
             <w:noProof/>
             <w:webHidden/>
           </w:rPr>
-          <w:instrText xml:space="preserve"> PAGEREF _Toc243647896 \h </w:instrText>
+          <w:instrText xml:space="preserve"> PAGEREF _Toc244085241 \h </w:instrText>
         </w:r>
         <w:r>
           <w:rPr>
@@ -2205,7 +2205,7 @@
           <w14:ligatures w14:val="standardContextual"/>
         </w:rPr>
       </w:pPr>
-      <w:hyperlink w:anchor="_Toc243647897" w:history="1">
+      <w:hyperlink w:anchor="_Toc244085242" w:history="1">
         <w:r>
           <w:rPr>
             <w:rStyle w:val="Hyperlink"/>
@@ -2250,7 +2250,7 @@
             <w:noProof/>
             <w:webHidden/>
           </w:rPr>
-          <w:instrText xml:space="preserve"> PAGEREF _Toc243647897 \h </w:instrText>
+          <w:instrText xml:space="preserve"> PAGEREF _Toc244085242 \h </w:instrText>
         </w:r>
         <w:r>
           <w:rPr>
@@ -2297,7 +2297,7 @@
           <w14:ligatures w14:val="standardContextual"/>
         </w:rPr>
       </w:pPr>
-      <w:hyperlink w:anchor="_Toc243647898" w:history="1">
+      <w:hyperlink w:anchor="_Toc244085243" w:history="1">
         <w:r>
           <w:rPr>
             <w:rStyle w:val="Hyperlink"/>
@@ -2342,7 +2342,7 @@
             <w:noProof/>
             <w:webHidden/>
           </w:rPr>
-          <w:instrText xml:space="preserve"> PAGEREF _Toc243647898 \h </w:instrText>
+          <w:instrText xml:space="preserve"> PAGEREF _Toc244085243 \h </w:instrText>
         </w:r>
         <w:r>
           <w:rPr>
@@ -2389,7 +2389,7 @@
           <w14:ligatures w14:val="standardContextual"/>
         </w:rPr>
       </w:pPr>
-      <w:hyperlink w:anchor="_Toc243647899" w:history="1">
+      <w:hyperlink w:anchor="_Toc244085244" w:history="1">
         <w:r>
           <w:rPr>
             <w:rStyle w:val="Hyperlink"/>
@@ -2434,7 +2434,7 @@
             <w:noProof/>
             <w:webHidden/>
           </w:rPr>
-          <w:instrText xml:space="preserve"> PAGEREF _Toc243647899 \h </w:instrText>
+          <w:instrText xml:space="preserve"> PAGEREF _Toc244085244 \h </w:instrText>
         </w:r>
         <w:r>
           <w:rPr>
@@ -2481,7 +2481,7 @@
           <w14:ligatures w14:val="standardContextual"/>
         </w:rPr>
       </w:pPr>
-      <w:hyperlink w:anchor="_Toc243647900" w:history="1">
+      <w:hyperlink w:anchor="_Toc244085245" w:history="1">
         <w:r>
           <w:rPr>
             <w:rStyle w:val="Hyperlink"/>
@@ -2526,7 +2526,7 @@
             <w:noProof/>
             <w:webHidden/>
           </w:rPr>
-          <w:instrText xml:space="preserve"> PAGEREF _Toc243647900 \h </w:instrText>
+          <w:instrText xml:space="preserve"> PAGEREF _Toc244085245 \h </w:instrText>
         </w:r>
         <w:r>
           <w:rPr>
@@ -2573,7 +2573,7 @@
           <w14:ligatures w14:val="standardContextual"/>
         </w:rPr>
       </w:pPr>
-      <w:hyperlink w:anchor="_Toc243647901" w:history="1">
+      <w:hyperlink w:anchor="_Toc244085246" w:history="1">
         <w:r>
           <w:rPr>
             <w:rStyle w:val="Hyperlink"/>
@@ -2618,7 +2618,7 @@
             <w:noProof/>
             <w:webHidden/>
           </w:rPr>
-          <w:instrText xml:space="preserve"> PAGEREF _Toc243647901 \h </w:instrText>
+          <w:instrText xml:space="preserve"> PAGEREF _Toc244085246 \h </w:instrText>
         </w:r>
         <w:r>
           <w:rPr>
@@ -2664,7 +2664,7 @@
           <w14:ligatures w14:val="standardContextual"/>
         </w:rPr>
       </w:pPr>
-      <w:hyperlink w:anchor="_Toc243647902" w:history="1">
+      <w:hyperlink w:anchor="_Toc244085247" w:history="1">
         <w:r>
           <w:rPr>
             <w:rStyle w:val="Hyperlink"/>
@@ -2691,7 +2691,7 @@
             <w:noProof/>
             <w:webHidden/>
           </w:rPr>
-          <w:instrText xml:space="preserve"> PAGEREF _Toc243647902 \h </w:instrText>
+          <w:instrText xml:space="preserve"> PAGEREF _Toc244085247 \h </w:instrText>
         </w:r>
         <w:r>
           <w:rPr>
@@ -2736,7 +2736,7 @@
       <w:pPr>
         <w:pStyle w:val="Heading1"/>
       </w:pPr>
-      <w:bookmarkStart w:id="0" w:name="_Toc243647874"/>
+      <w:bookmarkStart w:id="0" w:name="_Toc244085219"/>
       <w:r>
         <w:lastRenderedPageBreak/>
         <w:t>Accessible Procurement Process Overview</w:t>
@@ -2785,7 +2785,7 @@
       <w:pPr>
         <w:pStyle w:val="Heading2"/>
       </w:pPr>
-      <w:bookmarkStart w:id="1" w:name="_Toc243647875"/>
+      <w:bookmarkStart w:id="1" w:name="_Toc244085220"/>
       <w:r>
         <w:t>Read the requisition</w:t>
       </w:r>
@@ -2880,7 +2880,7 @@
       <w:pPr>
         <w:pStyle w:val="Heading2"/>
       </w:pPr>
-      <w:bookmarkStart w:id="2" w:name="_Toc243647876"/>
+      <w:bookmarkStart w:id="2" w:name="_Toc244085221"/>
       <w:r>
         <w:t>Check for prior reviews, plans and complaints</w:t>
       </w:r>
@@ -2936,7 +2936,7 @@
       <w:pPr>
         <w:pStyle w:val="Heading2"/>
       </w:pPr>
-      <w:bookmarkStart w:id="3" w:name="_Toc243647877"/>
+      <w:bookmarkStart w:id="3" w:name="_Toc244085222"/>
       <w:r>
         <w:t>Obtain the evidence</w:t>
       </w:r>
@@ -2988,7 +2988,7 @@
       <w:pPr>
         <w:pStyle w:val="Heading2"/>
       </w:pPr>
-      <w:bookmarkStart w:id="4" w:name="_Toc243647878"/>
+      <w:bookmarkStart w:id="4" w:name="_Toc244085223"/>
       <w:r>
         <w:t>Rate Exposure</w:t>
       </w:r>
@@ -3051,7 +3051,7 @@
       <w:pPr>
         <w:pStyle w:val="Heading2"/>
       </w:pPr>
-      <w:bookmarkStart w:id="5" w:name="_Toc243647879"/>
+      <w:bookmarkStart w:id="5" w:name="_Toc244085224"/>
       <w:r>
         <w:t>Rate Severity</w:t>
       </w:r>
@@ -3147,7 +3147,7 @@
       <w:pPr>
         <w:pStyle w:val="Heading2"/>
       </w:pPr>
-      <w:bookmarkStart w:id="6" w:name="_Toc243647880"/>
+      <w:bookmarkStart w:id="6" w:name="_Toc244085225"/>
       <w:r>
         <w:t>Read the risk grade</w:t>
       </w:r>
@@ -3195,7 +3195,7 @@
       <w:pPr>
         <w:pStyle w:val="Heading2"/>
       </w:pPr>
-      <w:bookmarkStart w:id="7" w:name="_Toc243647881"/>
+      <w:bookmarkStart w:id="7" w:name="_Toc244085226"/>
       <w:r>
         <w:t>Draft the TAAP</w:t>
       </w:r>
@@ -3377,7 +3377,7 @@
       <w:pPr>
         <w:pStyle w:val="Heading2"/>
       </w:pPr>
-      <w:bookmarkStart w:id="8" w:name="_Toc243647882"/>
+      <w:bookmarkStart w:id="8" w:name="_Toc244085227"/>
       <w:r>
         <w:t>Record the decision</w:t>
       </w:r>
@@ -3457,7 +3457,7 @@
       <w:pPr>
         <w:pStyle w:val="Heading2"/>
       </w:pPr>
-      <w:bookmarkStart w:id="9" w:name="_Toc243647883"/>
+      <w:bookmarkStart w:id="9" w:name="_Toc244085228"/>
       <w:r>
         <w:t>Keep the plan under review</w:t>
       </w:r>
@@ -3543,7 +3543,7 @@
         </w:rPr>
         <w:lastRenderedPageBreak/>
         <w:drawing>
-          <wp:inline distT="0" distB="0" distL="0" distR="0" wp14:anchorId="63D946AB" wp14:editId="21790C01">
+          <wp:inline distT="0" distB="0" distL="0" distR="0" wp14:anchorId="14E50CBF" wp14:editId="3226B143">
             <wp:extent cx="5486400" cy="6278880"/>
             <wp:effectExtent l="0" t="0" r="0" b="0"/>
             <wp:docPr id="1" name="Picture 1"/>
@@ -3601,7 +3601,7 @@
         </w:rPr>
         <w:lastRenderedPageBreak/>
         <w:drawing>
-          <wp:inline distT="0" distB="0" distL="0" distR="0" wp14:anchorId="3BCE3BD5" wp14:editId="71DA406E">
+          <wp:inline distT="0" distB="0" distL="0" distR="0" wp14:anchorId="116B21D2" wp14:editId="55FD3DE5">
             <wp:extent cx="5303520" cy="6500046"/>
             <wp:effectExtent l="0" t="0" r="0" b="0"/>
             <wp:docPr id="2" name="Picture 2"/>
@@ -3667,7 +3667,7 @@
       <w:pPr>
         <w:pStyle w:val="Heading1"/>
       </w:pPr>
-      <w:bookmarkStart w:id="10" w:name="_Toc243647884"/>
+      <w:bookmarkStart w:id="10" w:name="_Toc244085229"/>
       <w:r>
         <w:lastRenderedPageBreak/>
         <w:t>The rubric on one page</w:t>
@@ -3685,7 +3685,7 @@
           <w:noProof/>
         </w:rPr>
         <w:drawing>
-          <wp:inline distT="0" distB="0" distL="0" distR="0" wp14:anchorId="5CE6A4EF" wp14:editId="17525119">
+          <wp:inline distT="0" distB="0" distL="0" distR="0" wp14:anchorId="6F3C5467" wp14:editId="787EE7EE">
             <wp:extent cx="8229600" cy="3902962"/>
             <wp:effectExtent l="0" t="0" r="0" b="0"/>
             <wp:docPr id="3" name="Picture 3"/>
@@ -3750,7 +3750,7 @@
       <w:pPr>
         <w:pStyle w:val="Heading1"/>
       </w:pPr>
-      <w:bookmarkStart w:id="11" w:name="_Toc243647885"/>
+      <w:bookmarkStart w:id="11" w:name="_Toc244085230"/>
       <w:r>
         <w:lastRenderedPageBreak/>
         <w:t>Definitions</w:t>
@@ -3761,7 +3761,7 @@
       <w:pPr>
         <w:pStyle w:val="Heading2"/>
       </w:pPr>
-      <w:bookmarkStart w:id="12" w:name="_Toc243647886"/>
+      <w:bookmarkStart w:id="12" w:name="_Toc244085231"/>
       <w:r>
         <w:t>Review standard</w:t>
       </w:r>
@@ -3785,7 +3785,7 @@
       <w:pPr>
         <w:pStyle w:val="Heading2"/>
       </w:pPr>
-      <w:bookmarkStart w:id="13" w:name="_Toc243647887"/>
+      <w:bookmarkStart w:id="13" w:name="_Toc244085232"/>
       <w:r>
         <w:t>Essential function</w:t>
       </w:r>
@@ -3872,7 +3872,7 @@
       <w:pPr>
         <w:pStyle w:val="Heading2"/>
       </w:pPr>
-      <w:bookmarkStart w:id="14" w:name="_Toc243647888"/>
+      <w:bookmarkStart w:id="14" w:name="_Toc244085233"/>
       <w:r>
         <w:t>Nonconformance and barrier</w:t>
       </w:r>
@@ -4048,7 +4048,7 @@
       <w:pPr>
         <w:pStyle w:val="Heading2"/>
       </w:pPr>
-      <w:bookmarkStart w:id="15" w:name="_Toc243647889"/>
+      <w:bookmarkStart w:id="15" w:name="_Toc244085234"/>
       <w:r>
         <w:t>Minimal impact</w:t>
       </w:r>
@@ -4151,7 +4151,7 @@
       <w:pPr>
         <w:pStyle w:val="Heading2"/>
       </w:pPr>
-      <w:bookmarkStart w:id="16" w:name="_Toc243647890"/>
+      <w:bookmarkStart w:id="16" w:name="_Toc244085235"/>
       <w:r>
         <w:t>Finding</w:t>
       </w:r>
@@ -4249,7 +4249,7 @@
       <w:pPr>
         <w:pStyle w:val="Heading2"/>
       </w:pPr>
-      <w:bookmarkStart w:id="17" w:name="_Toc243647891"/>
+      <w:bookmarkStart w:id="17" w:name="_Toc244085236"/>
       <w:r>
         <w:t>Exposure</w:t>
       </w:r>
@@ -5386,14 +5386,14 @@
         <w:ind w:left="720"/>
       </w:pPr>
       <w:r>
-        <w:t>Under 2.5 points is low, from 2.5 to under 5.5 is medium, and from 5.5 up is high. Exposure is the lower of the start and the points band, held at the lowest level for the user count. A floor fact then raises it.</w:t>
+        <w:t>Under 2.5 points is low, from 2.5 to under 5.5 is medium, and from 5.5 up is high. Exposure is the lower of the start and the points band, held at the lowest level for the user count. Research use by one group, lab or project rates low for scope and for criticality. A floor fact then raises it.</w:t>
       </w:r>
     </w:p>
     <w:p>
       <w:pPr>
         <w:pStyle w:val="Heading2"/>
       </w:pPr>
-      <w:bookmarkStart w:id="18" w:name="_Toc243647892"/>
+      <w:bookmarkStart w:id="18" w:name="_Toc244085237"/>
       <w:r>
         <w:t>Severity</w:t>
       </w:r>
@@ -6385,7 +6385,7 @@
       <w:pPr>
         <w:pStyle w:val="Heading2"/>
       </w:pPr>
-      <w:bookmarkStart w:id="19" w:name="_Toc243647893"/>
+      <w:bookmarkStart w:id="19" w:name="_Toc244085238"/>
       <w:r>
         <w:t>Evidence (Veracity)</w:t>
       </w:r>
@@ -6947,7 +6947,7 @@
         <w:t xml:space="preserve">major release changes the first version component or carries the vendor's own major label, and an unknown release date neither raises nor lowers. An </w:t>
       </w:r>
       <w:r>
-        <w:t>outside firm is one the vendor does not own, is not affiliated with, and does not pay for remediation, and the firm's name and method print in the determination.</w:t>
+        <w:t>outside firm is any firm other than the vendor, and its name and method print in the determination.</w:t>
       </w:r>
     </w:p>
     <w:tbl>
@@ -6958,10 +6958,10 @@
         <w:tblLook w:val="04A0" w:firstRow="1" w:lastRow="0" w:firstColumn="1" w:lastColumn="0" w:noHBand="0" w:noVBand="1"/>
       </w:tblPr>
       <w:tblGrid>
-        <w:gridCol w:w="2173"/>
+        <w:gridCol w:w="2176"/>
+        <w:gridCol w:w="2155"/>
+        <w:gridCol w:w="2158"/>
         <w:gridCol w:w="2151"/>
-        <w:gridCol w:w="2169"/>
-        <w:gridCol w:w="2147"/>
       </w:tblGrid>
       <w:tr>
         <w:tc>
@@ -7148,7 +7148,7 @@
               <w:rPr>
                 <w:sz w:val="20"/>
               </w:rPr>
-              <w:t>The vendor's own staff, a firm the vendor owns, is affiliated with or pays for remediation, or no author named</w:t>
+              <w:t>The vendor's own staff, or no author named</w:t>
             </w:r>
           </w:p>
         </w:tc>
@@ -7198,14 +7198,14 @@
               <w:rPr>
                 <w:sz w:val="20"/>
               </w:rPr>
-              <w:t xml:space="preserve">The remarks read like a bug report. Each "Partially Supports" and "Does Not Support" row names the page, screen, component or workflow affected, how it falls short and who is </w:t>
+              <w:t xml:space="preserve">The remarks read like a bug report. Each "Partially Supports" and "Does Not Support" row names the page, screen, component or workflow affected, how it falls short and who is affected, and the "Supports" rows on </w:t>
             </w:r>
             <w:r>
               <w:rPr>
                 <w:sz w:val="20"/>
               </w:rPr>
               <w:lastRenderedPageBreak/>
-              <w:t>affected, and the "Supports" rows on complex criteria give an example or the method</w:t>
+              <w:t>complex criteria give an example or the method</w:t>
             </w:r>
           </w:p>
         </w:tc>
@@ -7222,14 +7222,14 @@
                 <w:sz w:val="20"/>
               </w:rPr>
               <w:lastRenderedPageBreak/>
-              <w:t xml:space="preserve">The remarks are blank, restate the criterion, repeat the same text across rows or hedge with "some", "most" or "generally", so the analyst cannot place a barrier on an essential function. The remarks </w:t>
+              <w:t xml:space="preserve">The remarks are blank, restate the criterion, repeat the same text across rows or hedge with "some", "most" or "generally", so the analyst cannot place a barrier on an essential function. The remarks name the feature or function with issues, </w:t>
             </w:r>
             <w:r>
               <w:rPr>
                 <w:sz w:val="20"/>
               </w:rPr>
               <w:lastRenderedPageBreak/>
-              <w:t>name the feature or function with issues, but not where it is, how it falls short or who is affected. The analyst does not take the ACR at face value and runs the spot check next</w:t>
+              <w:t>but not where it is, how it falls short or who is affected. The analyst does not take the ACR at face value and runs the spot check next</w:t>
             </w:r>
           </w:p>
         </w:tc>
@@ -7405,7 +7405,6 @@
         <w:rPr>
           <w:b/>
         </w:rPr>
-        <w:lastRenderedPageBreak/>
         <w:t>A contradicted ACR.</w:t>
       </w:r>
       <w:r>
@@ -7421,6 +7420,7 @@
         <w:rPr>
           <w:b/>
         </w:rPr>
+        <w:lastRenderedPageBreak/>
         <w:t>An ACR with a report defect.</w:t>
       </w:r>
       <w:r>
@@ -7465,7 +7465,7 @@
       <w:pPr>
         <w:pStyle w:val="Heading2"/>
       </w:pPr>
-      <w:bookmarkStart w:id="20" w:name="_Toc243647894"/>
+      <w:bookmarkStart w:id="20" w:name="_Toc244085239"/>
       <w:r>
         <w:t>Reading an ACR</w:t>
       </w:r>
@@ -7586,18 +7586,15 @@
         <w:t>The matrix.</w:t>
       </w:r>
       <w:r>
-        <w:t xml:space="preserve"> A web or mobile product reported on the 508 edition fails the edition check, because the review standard for those products is WCAG 2.1 AA and the report cannot speak to </w:t>
-      </w:r>
+        <w:t xml:space="preserve"> A web or mobile product reported on the 508 edition fails the edition check, because the review standard for those products is WCAG 2.1 AA and the report cannot speak to the 2.1 criteria at all. Desktop software and hardware reported on the 508 edition are on the right edition, since their review standard is the Section 508 Standards.</w:t>
+      </w:r>
+    </w:p>
+    <w:p>
+      <w:pPr>
+        <w:ind w:left="720"/>
+      </w:pPr>
       <w:r>
         <w:lastRenderedPageBreak/>
-        <w:t>the 2.1 criteria at all. Desktop software and hardware reported on the 508 edition are on the right edition, since their review standard is the Section 508 Standards.</w:t>
-      </w:r>
-    </w:p>
-    <w:p>
-      <w:pPr>
-        <w:ind w:left="720"/>
-      </w:pPr>
-      <w:r>
         <w:t>A report on a VPAT 1.x template predates the 2017 refresh of Section 508, so nobody has revised the report since then, and the Date entry applies.</w:t>
       </w:r>
     </w:p>
@@ -7754,10 +7751,10 @@
         <w:ind w:left="720"/>
       </w:pPr>
       <w:r>
-        <w:t>When none of those names anyone, the author is the vendor. The author matters because an ACR is a self-assessment unless an outside firm did the work. The matrix defines an outside firm</w:t>
-      </w:r>
-      <w:r>
-        <w:t xml:space="preserve"> as one the vendor does not own, is not affiliated with and does not pay for remediation.</w:t>
+        <w:t xml:space="preserve">When none of those names anyone, the author is the vendor. The author matters because an ACR is a self-assessment unless an outside firm did the work. The matrix treats any firm other than the vendor as an </w:t>
+      </w:r>
+      <w:r>
+        <w:t>outside firm.</w:t>
       </w:r>
     </w:p>
     <w:p>
@@ -7779,8 +7776,11 @@
         <w:ind w:left="720"/>
       </w:pPr>
       <w:r>
+        <w:t xml:space="preserve">The methods section says how the vendor tested. The VPAT instructions accept "knowledge of general product functionality" as a method, which means nobody tested anything, and it is the </w:t>
+      </w:r>
+      <w:r>
         <w:lastRenderedPageBreak/>
-        <w:t>The methods section says how the vendor tested. The VPAT instructions accept "knowledge of general product functionality" as a method, which means nobody tested anything, and it is the weakest method the instructions allow. A thorough evaluation names the browsers, the screen readers and the versions used.</w:t>
+        <w:t>weakest method the instructions allow. A thorough evaluation names the browsers, the screen readers and the versions used.</w:t>
       </w:r>
     </w:p>
     <w:p>
@@ -8532,7 +8532,7 @@
       <w:pPr>
         <w:pStyle w:val="Heading2"/>
       </w:pPr>
-      <w:bookmarkStart w:id="21" w:name="_Toc243647895"/>
+      <w:bookmarkStart w:id="21" w:name="_Toc244085240"/>
       <w:r>
         <w:t>Breadth</w:t>
       </w:r>
@@ -8588,7 +8588,7 @@
       <w:pPr>
         <w:pStyle w:val="Heading2"/>
       </w:pPr>
-      <w:bookmarkStart w:id="22" w:name="_Toc243647896"/>
+      <w:bookmarkStart w:id="22" w:name="_Toc244085241"/>
       <w:r>
         <w:t>TAAP</w:t>
       </w:r>
@@ -8797,7 +8797,7 @@
       <w:pPr>
         <w:pStyle w:val="Heading2"/>
       </w:pPr>
-      <w:bookmarkStart w:id="23" w:name="_Toc243647897"/>
+      <w:bookmarkStart w:id="23" w:name="_Toc244085242"/>
       <w:r>
         <w:t>Risk grade</w:t>
       </w:r>
@@ -9233,7 +9233,7 @@
       <w:pPr>
         <w:pStyle w:val="Heading2"/>
       </w:pPr>
-      <w:bookmarkStart w:id="24" w:name="_Toc243647898"/>
+      <w:bookmarkStart w:id="24" w:name="_Toc244085243"/>
       <w:r>
         <w:t>Pressure and the TAAP standard</w:t>
       </w:r>
@@ -9690,7 +9690,7 @@
       <w:pPr>
         <w:pStyle w:val="Heading2"/>
       </w:pPr>
-      <w:bookmarkStart w:id="25" w:name="_Toc243647899"/>
+      <w:bookmarkStart w:id="25" w:name="_Toc244085244"/>
       <w:r>
         <w:t>Warning level</w:t>
       </w:r>
@@ -10057,7 +10057,7 @@
       <w:pPr>
         <w:pStyle w:val="Heading2"/>
       </w:pPr>
-      <w:bookmarkStart w:id="26" w:name="_Toc243647900"/>
+      <w:bookmarkStart w:id="26" w:name="_Toc244085245"/>
       <w:r>
         <w:t>Final decision</w:t>
       </w:r>
@@ -10288,7 +10288,7 @@
       <w:pPr>
         <w:pStyle w:val="Heading2"/>
       </w:pPr>
-      <w:bookmarkStart w:id="27" w:name="_Toc243647901"/>
+      <w:bookmarkStart w:id="27" w:name="_Toc244085246"/>
       <w:r>
         <w:t>Holds</w:t>
       </w:r>
@@ -10878,7 +10878,7 @@
           <w:numId w:val="0"/>
         </w:numPr>
       </w:pPr>
-      <w:bookmarkStart w:id="28" w:name="_Toc243647902"/>
+      <w:bookmarkStart w:id="28" w:name="_Toc244085247"/>
       <w:r>
         <w:lastRenderedPageBreak/>
         <w:t>Notes</w:t>
@@ -12341,7 +12341,7 @@
         <w:sz w:val="18"/>
       </w:rPr>
       <w:tab/>
-      <w:t>Matrix version 3, 2026-10-23</w:t>
+      <w:t>Matrix version 3, 2026-10-28</w:t>
     </w:r>
   </w:p>
 </w:hdr>
@@ -12374,7 +12374,7 @@
         <w:sz w:val="18"/>
       </w:rPr>
       <w:tab/>
-      <w:t>Matrix version 3, 2026-10-23</w:t>
+      <w:t>Matrix version 3, 2026-10-28</w:t>
     </w:r>
   </w:p>
 </w:hdr>
@@ -12405,7 +12405,7 @@
         <w:sz w:val="18"/>
       </w:rPr>
       <w:tab/>
-      <w:t>Matrix version 3, 2026-10-23</w:t>
+      <w:t>Matrix version 3, 2026-10-28</w:t>
     </w:r>
   </w:p>
 </w:hdr>
@@ -12585,9 +12585,9 @@
     </w:lvl>
   </w:abstractNum>
   <w:abstractNum w:abstractNumId="9" w15:restartNumberingAfterBreak="0">
-    <w:nsid w:val="517F49A0"/>
+    <w:nsid w:val="77E85002"/>
     <w:multiLevelType w:val="multilevel"/>
-    <w:tmpl w:val="80581F16"/>
+    <w:tmpl w:val="5EECDCD4"/>
     <w:lvl w:ilvl="0">
       <w:start w:val="1"/>
       <w:numFmt w:val="decimal"/>
@@ -12649,34 +12649,34 @@
       <w:lvlJc w:val="left"/>
     </w:lvl>
   </w:abstractNum>
-  <w:num w:numId="1" w16cid:durableId="477962130">
+  <w:num w:numId="1" w16cid:durableId="1544441285">
     <w:abstractNumId w:val="8"/>
   </w:num>
-  <w:num w:numId="2" w16cid:durableId="743989211">
+  <w:num w:numId="2" w16cid:durableId="708140008">
     <w:abstractNumId w:val="6"/>
   </w:num>
-  <w:num w:numId="3" w16cid:durableId="1847548155">
+  <w:num w:numId="3" w16cid:durableId="1386611002">
     <w:abstractNumId w:val="5"/>
   </w:num>
-  <w:num w:numId="4" w16cid:durableId="671033676">
+  <w:num w:numId="4" w16cid:durableId="2141797378">
     <w:abstractNumId w:val="4"/>
   </w:num>
-  <w:num w:numId="5" w16cid:durableId="1941067231">
+  <w:num w:numId="5" w16cid:durableId="1926306939">
     <w:abstractNumId w:val="7"/>
   </w:num>
-  <w:num w:numId="6" w16cid:durableId="710879906">
+  <w:num w:numId="6" w16cid:durableId="1196388011">
     <w:abstractNumId w:val="3"/>
   </w:num>
-  <w:num w:numId="7" w16cid:durableId="927536981">
+  <w:num w:numId="7" w16cid:durableId="1289094129">
     <w:abstractNumId w:val="2"/>
   </w:num>
-  <w:num w:numId="8" w16cid:durableId="1056902611">
+  <w:num w:numId="8" w16cid:durableId="1222521175">
     <w:abstractNumId w:val="1"/>
   </w:num>
-  <w:num w:numId="9" w16cid:durableId="1102721712">
+  <w:num w:numId="9" w16cid:durableId="673648854">
     <w:abstractNumId w:val="0"/>
   </w:num>
-  <w:num w:numId="10" w16cid:durableId="166289344">
+  <w:num w:numId="10" w16cid:durableId="466750313">
     <w:abstractNumId w:val="9"/>
   </w:num>
 </w:numbering>
@@ -24078,7 +24078,7 @@
     <w:uiPriority w:val="99"/>
     <w:semiHidden/>
     <w:unhideWhenUsed/>
-    <w:rsid w:val="00177465"/>
+    <w:rsid w:val="00A3028D"/>
     <w:pPr>
       <w:spacing w:after="80" w:line="240" w:lineRule="auto"/>
     </w:pPr>
@@ -24093,7 +24093,7 @@
     <w:link w:val="EndnoteText"/>
     <w:uiPriority w:val="99"/>
     <w:semiHidden/>
-    <w:rsid w:val="00177465"/>
+    <w:rsid w:val="00A3028D"/>
     <w:rPr>
       <w:rFonts w:ascii="Calibri" w:hAnsi="Calibri"/>
       <w:sz w:val="20"/>
@@ -24106,7 +24106,7 @@
     <w:uiPriority w:val="99"/>
     <w:semiHidden/>
     <w:unhideWhenUsed/>
-    <w:rsid w:val="00177465"/>
+    <w:rsid w:val="00A3028D"/>
     <w:rPr>
       <w:vertAlign w:val="superscript"/>
     </w:rPr>
@@ -24118,7 +24118,7 @@
     <w:autoRedefine/>
     <w:uiPriority w:val="39"/>
     <w:unhideWhenUsed/>
-    <w:rsid w:val="00177465"/>
+    <w:rsid w:val="00A3028D"/>
     <w:pPr>
       <w:spacing w:after="100"/>
     </w:pPr>
@@ -24130,7 +24130,7 @@
     <w:autoRedefine/>
     <w:uiPriority w:val="39"/>
     <w:unhideWhenUsed/>
-    <w:rsid w:val="00177465"/>
+    <w:rsid w:val="00A3028D"/>
     <w:pPr>
       <w:spacing w:after="100"/>
       <w:ind w:left="220"/>
@@ -24141,7 +24141,7 @@
     <w:basedOn w:val="DefaultParagraphFont"/>
     <w:uiPriority w:val="99"/>
     <w:unhideWhenUsed/>
-    <w:rsid w:val="00177465"/>
+    <w:rsid w:val="00A3028D"/>
     <w:rPr>
       <w:color w:val="0000FF" w:themeColor="hyperlink"/>
       <w:u w:val="single"/>

</xml_diff>